<commit_message>
Complete official inflation and sentiment history from supplied August report
</commit_message>
<xml_diff>
--- a/submission/Lab1_Andreus_85/Andreus_LR1_var85.docx
+++ b/submission/Lab1_Andreus_85/Andreus_LR1_var85.docx
@@ -143,13 +143,13 @@
           <w:b/>
           <w:bCs/>
         </w:rPr>
-        <w:t xml:space="preserve">Ограничение исторической части.</w:t>
+        <w:t xml:space="preserve">Источник исторической части.</w:t>
       </w:r>
       <w:r>
         <w:t xml:space="preserve"> </w:t>
       </w:r>
       <w:r>
-        <w:t xml:space="preserve">В приложениях нет подтвержденного официального ряда за январь–август 2026 года: объединенный PDF содержит учебные материалы по R, а числам из примера другого студента не приписывается достоверность официальной публикации. При попытке обращения к указанному ресурсу Банка России 18.10.2026 среда вернула HTTP 403 на этапе CONNECT. Поэтому официальные значения оставлены как NA; направления изменений август → сентябрь не установлены. Рисунки 7–8 и таблица динамики содержат явно обозначенные заготовки, автоматически обновляемые после ввода проверенных значений в начале блока исторических данных. Эта часть обязательного задания пока не завершена.</w:t>
+        <w:t xml:space="preserve">Опубликованные значения января–августа 2026 года перенесены из предоставленного отчета инФОМ за август 2026 года (волна 162): с. 10, рис. 6 — две инфляционные медианы; с. 14, рис. 12 — ИТС, ИПО и ИПН. Дата получения и проверки PDF — 18.10.2026. Использованы числовые подписи к точкам с точностью публикации: один десятичный знак для инфляции и целые пункты для индексов. Длина линий не измерялась, дополнительные знаки не восстанавливались. Учебные сентябрьские точки выделены отдельно и не соединены с официальными линиями.</w:t>
       </w:r>
     </w:p>
     <w:bookmarkEnd w:id="20"/>
@@ -16419,7 +16419,7 @@
         <w:pStyle w:val="FirstParagraph"/>
       </w:pPr>
       <w:r>
-        <w:t xml:space="preserve">Основание N = 1630, F_prev = 779, частота медианного интервала f = 127. Обычная медиана — 27500,0 руб., уточненная — 26417,3 руб.; различие вызвано группировкой и допущением о распределении внутри класса. Оценки чувствительны к условным кодам крайних доходных интервалов и к качеству Q12. Официальный медианный доход в приложениях не подтвержден, поэтому числовое сравнение не выполняется. Даже при наличии такого числа прямое сопоставление ограничено различиями методик, состава и весов выборок; учебный показатель не является официальной оценкой дохода населения.</w:t>
+        <w:t xml:space="preserve">Основание N = 1630, F_prev = 779, частота медианного интервала f = 127. Обычная медиана — 27500,0 руб., уточненная — 26417,3 руб.; различие вызвано группировкой и допущением о распределении внутри класса. Оценки чувствительны к условным кодам крайних доходных интервалов и к качеству Q12. На с. 20 (рис. 16) опубликована августовская медиана среднедушевого располагаемого дохода 27,3 тыс. руб., то есть 27300 руб. Обычная учебная медиана отличается от нее на +200,0 руб., уточненная — на -882,7 руб. Прямое сопоставление ограничено различиями методик, состава и весов выборок; учебный показатель не является официальной оценкой дохода населения.</w:t>
       </w:r>
     </w:p>
     <w:bookmarkEnd w:id="25"/>
@@ -21282,37 +21282,7 @@
         <w:pStyle w:val="FirstParagraph"/>
       </w:pPr>
       <w:r>
-        <w:t xml:space="preserve">На рисунке 7 треугольники обозначают синтетический сентябрь; январь–август оставлены без линии, поскольку подтвержденные официальные числа не получены. После заполнения векторов</w:t>
-      </w:r>
-      <w:r>
-        <w:t xml:space="preserve"> </w:t>
-      </w:r>
-      <w:r>
-        <w:rPr>
-          <w:rStyle w:val="VerbatimChar"/>
-        </w:rPr>
-        <w:t xml:space="preserve">official_obs</w:t>
-      </w:r>
-      <w:r>
-        <w:t xml:space="preserve"> </w:t>
-      </w:r>
-      <w:r>
-        <w:t xml:space="preserve">и</w:t>
-      </w:r>
-      <w:r>
-        <w:t xml:space="preserve"> </w:t>
-      </w:r>
-      <w:r>
-        <w:rPr>
-          <w:rStyle w:val="VerbatimChar"/>
-        </w:rPr>
-        <w:t xml:space="preserve">official_exp</w:t>
-      </w:r>
-      <w:r>
-        <w:t xml:space="preserve"> </w:t>
-      </w:r>
-      <w:r>
-        <w:t xml:space="preserve">код построит официальные линии и отдельные учебные точки без соединения между августом и сентябрем. В текущем виде это честная заготовка обязательного временного графика, а не восстановленный официальный ряд.</w:t>
+        <w:t xml:space="preserve">На рисунке 7 линии и круглые точки показывают опубликованные медианы января–августа 2026 года; треугольники — синтетический сентябрь. Сентябрьские точки не соединены с официальной историей. Ось Y — проценты годовых; числовые подписи исходного отчета приведены в таблице истории.</w:t>
       </w:r>
     </w:p>
     <w:p>
@@ -21324,7 +21294,7 @@
           <wp:inline>
             <wp:extent cx="5753100" cy="3519543"/>
             <wp:effectExtent b="0" l="0" r="0" t="0"/>
-            <wp:docPr descr="Рисунок 7. Медианы инфляции за 2026 год, % годовых: треугольники — учебный сентябрь; официальный ряд января–августа отсутствует." title="" id="57" name="Picture"/>
+            <wp:docPr descr="Рисунок 7. Медианы инфляции, % годовых: линии и круги — опубликованный январь–август; треугольники — учебный сентябрь." title="" id="57" name="Picture"/>
             <a:graphic>
               <a:graphicData uri="http://schemas.openxmlformats.org/drawingml/2006/picture">
                 <pic:pic>
@@ -21367,7 +21337,7 @@
         <w:pStyle w:val="ImageCaption"/>
       </w:pPr>
       <w:r>
-        <w:t xml:space="preserve">Рисунок 7. Медианы инфляции за 2026 год, % годовых: треугольники — учебный сентябрь; официальный ряд января–августа отсутствует.</w:t>
+        <w:t xml:space="preserve">Рисунок 7. Медианы инфляции, % годовых: линии и круги — опубликованный январь–август; треугольники — учебный сентябрь.</w:t>
       </w:r>
     </w:p>
     <w:bookmarkEnd w:id="59"/>
@@ -21385,7 +21355,7 @@
         <w:pStyle w:val="FirstParagraph"/>
       </w:pPr>
       <w:r>
-        <w:t xml:space="preserve">Рисунок 8 использует тот же способ выделения синтетических точек. Отсутствие официальной линии означает отсутствие проверенных значений, а не нулевые индексы. Сентябрьские точки не соединяются с историей.</w:t>
+        <w:t xml:space="preserve">Рисунок 8 показывает официальные ИТС, ИПО и ИПН за январь–август 2026 года линиями и круглыми точками. Учебные сентябрьские значения обозначены треугольниками без соединения с историческими линиями. Единицы измерения — пункты индекса.</w:t>
       </w:r>
     </w:p>
     <w:p>
@@ -21397,7 +21367,7 @@
           <wp:inline>
             <wp:extent cx="5753100" cy="3519543"/>
             <wp:effectExtent b="0" l="0" r="0" t="0"/>
-            <wp:docPr descr="Рисунок 8. ИТС, ИПО, ИПН за 2026 год, пункты: треугольники — учебный сентябрь; значения января–августа не получены." title="" id="61" name="Picture"/>
+            <wp:docPr descr="Рисунок 8. ИТС, ИПО, ИПН, пункты: линии и круги — опубликованный январь–август; треугольники — учебный сентябрь." title="" id="61" name="Picture"/>
             <a:graphic>
               <a:graphicData uri="http://schemas.openxmlformats.org/drawingml/2006/picture">
                 <pic:pic>
@@ -21440,7 +21410,7 @@
         <w:pStyle w:val="ImageCaption"/>
       </w:pPr>
       <w:r>
-        <w:t xml:space="preserve">Рисунок 8. ИТС, ИПО, ИПН за 2026 год, пункты: треугольники — учебный сентябрь; значения января–августа не получены.</w:t>
+        <w:t xml:space="preserve">Рисунок 8. ИТС, ИПО, ИПН, пункты: линии и круги — опубликованный январь–август; треугольники — учебный сентябрь.</w:t>
       </w:r>
     </w:p>
     <w:bookmarkEnd w:id="63"/>
@@ -21459,7 +21429,7 @@
         <w:pStyle w:val="FirstParagraph"/>
       </w:pPr>
       <w:r>
-        <w:t xml:space="preserve">Для каждой точки задан календарный период и источник. Исторические значения, дата успешного получения и точность публикации пока отсутствуют; неуспешная попытка доступа выполнена 18.10.2026. Нужный ресурс — раздел Банка России «Инфляционные ожидания и потребительские настроения», отчет за август 2026 года (волна 162), рисунки 6 и 12 на с. 10 и 14. При появлении машиночитаемых таблиц следует брать точные опубликованные значения, а не измерять линии рисунков. Официальные числа в работе друга не использованы: их происхождение и точность не подтверждены первоисточником.</w:t>
+        <w:t xml:space="preserve">Для каждой точки в расчетной таблице указан календарный период и источник. Официальная история перенесена из числовых подписей на рисунках 6 и 12 предоставленного PDF «Измерение инфляционных ожиданий и потребительских настроений», август 2026 года, волна 162 (с. 10 и 14). Дата получения и проверки — 18.10.2026. Инфляционные медианы опубликованы с одним десятичным знаком, индексы — целыми пунктами. Приложенная CSV-таблица и файл SOURCE_NOTES.txt фиксируют происхождение данных. Опубликованный ИПН используется непосредственно: пересчет по уже округленным ИТС и ИПО может дать другое число.</w:t>
       </w:r>
     </w:p>
     <w:p>
@@ -21467,25 +21437,24 @@
         <w:pStyle w:val="TableCaption"/>
       </w:pPr>
       <w:r>
-        <w:t xml:space="preserve">Таблица 40. Помесячные уровни и источник: NA означает отсутствие подтвержденного числа</w:t>
+        <w:t xml:space="preserve">Таблица 40. Помесячные уровни и источник: официальные уровни и учебный сентябрь</w:t>
       </w:r>
     </w:p>
     <w:tbl>
       <w:tblPr>
         <w:tblStyle w:val="Table"/>
-        <w:tblW w:type="pct" w:w="5000"/>
+        <w:tblW w:type="auto" w:w="0"/>
         <w:jc w:val="left"/>
-        <w:tblLayout w:type="fixed"/>
         <w:tblLook w:firstRow="1" w:lastRow="0" w:firstColumn="0" w:lastColumn="0" w:noHBand="0" w:noVBand="0" w:val="0020"/>
       </w:tblPr>
       <w:tblGrid>
-        <w:gridCol w:w="609"/>
-        <w:gridCol w:w="837"/>
-        <w:gridCol w:w="837"/>
-        <w:gridCol w:w="837"/>
-        <w:gridCol w:w="837"/>
-        <w:gridCol w:w="837"/>
-        <w:gridCol w:w="3122"/>
+        <w:gridCol w:w="1131"/>
+        <w:gridCol w:w="1131"/>
+        <w:gridCol w:w="1131"/>
+        <w:gridCol w:w="1131"/>
+        <w:gridCol w:w="1131"/>
+        <w:gridCol w:w="1131"/>
+        <w:gridCol w:w="1131"/>
       </w:tblGrid>
       <w:tr>
         <w:trPr>
@@ -21597,67 +21566,67 @@
               <w:jc w:val="right"/>
             </w:pPr>
             <w:r>
-              <w:t xml:space="preserve">нет данных</w:t>
-            </w:r>
-          </w:p>
-        </w:tc>
-        <w:tc>
-          <w:tcPr/>
-          <w:p>
-            <w:pPr>
-              <w:pStyle w:val="Compact"/>
-              <w:jc w:val="right"/>
-            </w:pPr>
-            <w:r>
-              <w:t xml:space="preserve">нет данных</w:t>
-            </w:r>
-          </w:p>
-        </w:tc>
-        <w:tc>
-          <w:tcPr/>
-          <w:p>
-            <w:pPr>
-              <w:pStyle w:val="Compact"/>
-              <w:jc w:val="right"/>
-            </w:pPr>
-            <w:r>
-              <w:t xml:space="preserve">нет данных</w:t>
-            </w:r>
-          </w:p>
-        </w:tc>
-        <w:tc>
-          <w:tcPr/>
-          <w:p>
-            <w:pPr>
-              <w:pStyle w:val="Compact"/>
-              <w:jc w:val="right"/>
-            </w:pPr>
-            <w:r>
-              <w:t xml:space="preserve">нет данных</w:t>
-            </w:r>
-          </w:p>
-        </w:tc>
-        <w:tc>
-          <w:tcPr/>
-          <w:p>
-            <w:pPr>
-              <w:pStyle w:val="Compact"/>
-              <w:jc w:val="right"/>
-            </w:pPr>
-            <w:r>
-              <w:t xml:space="preserve">нет данных</w:t>
-            </w:r>
-          </w:p>
-        </w:tc>
-        <w:tc>
-          <w:tcPr/>
-          <w:p>
-            <w:pPr>
-              <w:pStyle w:val="Compact"/>
-              <w:jc w:val="left"/>
-            </w:pPr>
-            <w:r>
-              <w:t xml:space="preserve">Опубликованный ряд: значение не получено</w:t>
+              <w:t xml:space="preserve">14.5</w:t>
+            </w:r>
+          </w:p>
+        </w:tc>
+        <w:tc>
+          <w:tcPr/>
+          <w:p>
+            <w:pPr>
+              <w:pStyle w:val="Compact"/>
+              <w:jc w:val="right"/>
+            </w:pPr>
+            <w:r>
+              <w:t xml:space="preserve">13.7</w:t>
+            </w:r>
+          </w:p>
+        </w:tc>
+        <w:tc>
+          <w:tcPr/>
+          <w:p>
+            <w:pPr>
+              <w:pStyle w:val="Compact"/>
+              <w:jc w:val="right"/>
+            </w:pPr>
+            <w:r>
+              <w:t xml:space="preserve">91.0</w:t>
+            </w:r>
+          </w:p>
+        </w:tc>
+        <w:tc>
+          <w:tcPr/>
+          <w:p>
+            <w:pPr>
+              <w:pStyle w:val="Compact"/>
+              <w:jc w:val="right"/>
+            </w:pPr>
+            <w:r>
+              <w:t xml:space="preserve">107.0</w:t>
+            </w:r>
+          </w:p>
+        </w:tc>
+        <w:tc>
+          <w:tcPr/>
+          <w:p>
+            <w:pPr>
+              <w:pStyle w:val="Compact"/>
+              <w:jc w:val="right"/>
+            </w:pPr>
+            <w:r>
+              <w:t xml:space="preserve">101.0</w:t>
+            </w:r>
+          </w:p>
+        </w:tc>
+        <w:tc>
+          <w:tcPr/>
+          <w:p>
+            <w:pPr>
+              <w:pStyle w:val="Compact"/>
+              <w:jc w:val="left"/>
+            </w:pPr>
+            <w:r>
+              <w:t xml:space="preserve">Опубликованный ряд</w:t>
             </w:r>
           </w:p>
         </w:tc>
@@ -21683,67 +21652,67 @@
               <w:jc w:val="right"/>
             </w:pPr>
             <w:r>
-              <w:t xml:space="preserve">нет данных</w:t>
-            </w:r>
-          </w:p>
-        </w:tc>
-        <w:tc>
-          <w:tcPr/>
-          <w:p>
-            <w:pPr>
-              <w:pStyle w:val="Compact"/>
-              <w:jc w:val="right"/>
-            </w:pPr>
-            <w:r>
-              <w:t xml:space="preserve">нет данных</w:t>
-            </w:r>
-          </w:p>
-        </w:tc>
-        <w:tc>
-          <w:tcPr/>
-          <w:p>
-            <w:pPr>
-              <w:pStyle w:val="Compact"/>
-              <w:jc w:val="right"/>
-            </w:pPr>
-            <w:r>
-              <w:t xml:space="preserve">нет данных</w:t>
-            </w:r>
-          </w:p>
-        </w:tc>
-        <w:tc>
-          <w:tcPr/>
-          <w:p>
-            <w:pPr>
-              <w:pStyle w:val="Compact"/>
-              <w:jc w:val="right"/>
-            </w:pPr>
-            <w:r>
-              <w:t xml:space="preserve">нет данных</w:t>
-            </w:r>
-          </w:p>
-        </w:tc>
-        <w:tc>
-          <w:tcPr/>
-          <w:p>
-            <w:pPr>
-              <w:pStyle w:val="Compact"/>
-              <w:jc w:val="right"/>
-            </w:pPr>
-            <w:r>
-              <w:t xml:space="preserve">нет данных</w:t>
-            </w:r>
-          </w:p>
-        </w:tc>
-        <w:tc>
-          <w:tcPr/>
-          <w:p>
-            <w:pPr>
-              <w:pStyle w:val="Compact"/>
-              <w:jc w:val="left"/>
-            </w:pPr>
-            <w:r>
-              <w:t xml:space="preserve">Опубликованный ряд: значение не получено</w:t>
+              <w:t xml:space="preserve">14.5</w:t>
+            </w:r>
+          </w:p>
+        </w:tc>
+        <w:tc>
+          <w:tcPr/>
+          <w:p>
+            <w:pPr>
+              <w:pStyle w:val="Compact"/>
+              <w:jc w:val="right"/>
+            </w:pPr>
+            <w:r>
+              <w:t xml:space="preserve">13.1</w:t>
+            </w:r>
+          </w:p>
+        </w:tc>
+        <w:tc>
+          <w:tcPr/>
+          <w:p>
+            <w:pPr>
+              <w:pStyle w:val="Compact"/>
+              <w:jc w:val="right"/>
+            </w:pPr>
+            <w:r>
+              <w:t xml:space="preserve">88.0</w:t>
+            </w:r>
+          </w:p>
+        </w:tc>
+        <w:tc>
+          <w:tcPr/>
+          <w:p>
+            <w:pPr>
+              <w:pStyle w:val="Compact"/>
+              <w:jc w:val="right"/>
+            </w:pPr>
+            <w:r>
+              <w:t xml:space="preserve">104.0</w:t>
+            </w:r>
+          </w:p>
+        </w:tc>
+        <w:tc>
+          <w:tcPr/>
+          <w:p>
+            <w:pPr>
+              <w:pStyle w:val="Compact"/>
+              <w:jc w:val="right"/>
+            </w:pPr>
+            <w:r>
+              <w:t xml:space="preserve">98.0</w:t>
+            </w:r>
+          </w:p>
+        </w:tc>
+        <w:tc>
+          <w:tcPr/>
+          <w:p>
+            <w:pPr>
+              <w:pStyle w:val="Compact"/>
+              <w:jc w:val="left"/>
+            </w:pPr>
+            <w:r>
+              <w:t xml:space="preserve">Опубликованный ряд</w:t>
             </w:r>
           </w:p>
         </w:tc>
@@ -21769,67 +21738,67 @@
               <w:jc w:val="right"/>
             </w:pPr>
             <w:r>
-              <w:t xml:space="preserve">нет данных</w:t>
-            </w:r>
-          </w:p>
-        </w:tc>
-        <w:tc>
-          <w:tcPr/>
-          <w:p>
-            <w:pPr>
-              <w:pStyle w:val="Compact"/>
-              <w:jc w:val="right"/>
-            </w:pPr>
-            <w:r>
-              <w:t xml:space="preserve">нет данных</w:t>
-            </w:r>
-          </w:p>
-        </w:tc>
-        <w:tc>
-          <w:tcPr/>
-          <w:p>
-            <w:pPr>
-              <w:pStyle w:val="Compact"/>
-              <w:jc w:val="right"/>
-            </w:pPr>
-            <w:r>
-              <w:t xml:space="preserve">нет данных</w:t>
-            </w:r>
-          </w:p>
-        </w:tc>
-        <w:tc>
-          <w:tcPr/>
-          <w:p>
-            <w:pPr>
-              <w:pStyle w:val="Compact"/>
-              <w:jc w:val="right"/>
-            </w:pPr>
-            <w:r>
-              <w:t xml:space="preserve">нет данных</w:t>
-            </w:r>
-          </w:p>
-        </w:tc>
-        <w:tc>
-          <w:tcPr/>
-          <w:p>
-            <w:pPr>
-              <w:pStyle w:val="Compact"/>
-              <w:jc w:val="right"/>
-            </w:pPr>
-            <w:r>
-              <w:t xml:space="preserve">нет данных</w:t>
-            </w:r>
-          </w:p>
-        </w:tc>
-        <w:tc>
-          <w:tcPr/>
-          <w:p>
-            <w:pPr>
-              <w:pStyle w:val="Compact"/>
-              <w:jc w:val="left"/>
-            </w:pPr>
-            <w:r>
-              <w:t xml:space="preserve">Опубликованный ряд: значение не получено</w:t>
+              <w:t xml:space="preserve">15.6</w:t>
+            </w:r>
+          </w:p>
+        </w:tc>
+        <w:tc>
+          <w:tcPr/>
+          <w:p>
+            <w:pPr>
+              <w:pStyle w:val="Compact"/>
+              <w:jc w:val="right"/>
+            </w:pPr>
+            <w:r>
+              <w:t xml:space="preserve">13.4</w:t>
+            </w:r>
+          </w:p>
+        </w:tc>
+        <w:tc>
+          <w:tcPr/>
+          <w:p>
+            <w:pPr>
+              <w:pStyle w:val="Compact"/>
+              <w:jc w:val="right"/>
+            </w:pPr>
+            <w:r>
+              <w:t xml:space="preserve">88.0</w:t>
+            </w:r>
+          </w:p>
+        </w:tc>
+        <w:tc>
+          <w:tcPr/>
+          <w:p>
+            <w:pPr>
+              <w:pStyle w:val="Compact"/>
+              <w:jc w:val="right"/>
+            </w:pPr>
+            <w:r>
+              <w:t xml:space="preserve">105.0</w:t>
+            </w:r>
+          </w:p>
+        </w:tc>
+        <w:tc>
+          <w:tcPr/>
+          <w:p>
+            <w:pPr>
+              <w:pStyle w:val="Compact"/>
+              <w:jc w:val="right"/>
+            </w:pPr>
+            <w:r>
+              <w:t xml:space="preserve">98.0</w:t>
+            </w:r>
+          </w:p>
+        </w:tc>
+        <w:tc>
+          <w:tcPr/>
+          <w:p>
+            <w:pPr>
+              <w:pStyle w:val="Compact"/>
+              <w:jc w:val="left"/>
+            </w:pPr>
+            <w:r>
+              <w:t xml:space="preserve">Опубликованный ряд</w:t>
             </w:r>
           </w:p>
         </w:tc>
@@ -21855,67 +21824,67 @@
               <w:jc w:val="right"/>
             </w:pPr>
             <w:r>
-              <w:t xml:space="preserve">нет данных</w:t>
-            </w:r>
-          </w:p>
-        </w:tc>
-        <w:tc>
-          <w:tcPr/>
-          <w:p>
-            <w:pPr>
-              <w:pStyle w:val="Compact"/>
-              <w:jc w:val="right"/>
-            </w:pPr>
-            <w:r>
-              <w:t xml:space="preserve">нет данных</w:t>
-            </w:r>
-          </w:p>
-        </w:tc>
-        <w:tc>
-          <w:tcPr/>
-          <w:p>
-            <w:pPr>
-              <w:pStyle w:val="Compact"/>
-              <w:jc w:val="right"/>
-            </w:pPr>
-            <w:r>
-              <w:t xml:space="preserve">нет данных</w:t>
-            </w:r>
-          </w:p>
-        </w:tc>
-        <w:tc>
-          <w:tcPr/>
-          <w:p>
-            <w:pPr>
-              <w:pStyle w:val="Compact"/>
-              <w:jc w:val="right"/>
-            </w:pPr>
-            <w:r>
-              <w:t xml:space="preserve">нет данных</w:t>
-            </w:r>
-          </w:p>
-        </w:tc>
-        <w:tc>
-          <w:tcPr/>
-          <w:p>
-            <w:pPr>
-              <w:pStyle w:val="Compact"/>
-              <w:jc w:val="right"/>
-            </w:pPr>
-            <w:r>
-              <w:t xml:space="preserve">нет данных</w:t>
-            </w:r>
-          </w:p>
-        </w:tc>
-        <w:tc>
-          <w:tcPr/>
-          <w:p>
-            <w:pPr>
-              <w:pStyle w:val="Compact"/>
-              <w:jc w:val="left"/>
-            </w:pPr>
-            <w:r>
-              <w:t xml:space="preserve">Опубликованный ряд: значение не получено</w:t>
+              <w:t xml:space="preserve">14.6</w:t>
+            </w:r>
+          </w:p>
+        </w:tc>
+        <w:tc>
+          <w:tcPr/>
+          <w:p>
+            <w:pPr>
+              <w:pStyle w:val="Compact"/>
+              <w:jc w:val="right"/>
+            </w:pPr>
+            <w:r>
+              <w:t xml:space="preserve">12.9</w:t>
+            </w:r>
+          </w:p>
+        </w:tc>
+        <w:tc>
+          <w:tcPr/>
+          <w:p>
+            <w:pPr>
+              <w:pStyle w:val="Compact"/>
+              <w:jc w:val="right"/>
+            </w:pPr>
+            <w:r>
+              <w:t xml:space="preserve">85.0</w:t>
+            </w:r>
+          </w:p>
+        </w:tc>
+        <w:tc>
+          <w:tcPr/>
+          <w:p>
+            <w:pPr>
+              <w:pStyle w:val="Compact"/>
+              <w:jc w:val="right"/>
+            </w:pPr>
+            <w:r>
+              <w:t xml:space="preserve">101.0</w:t>
+            </w:r>
+          </w:p>
+        </w:tc>
+        <w:tc>
+          <w:tcPr/>
+          <w:p>
+            <w:pPr>
+              <w:pStyle w:val="Compact"/>
+              <w:jc w:val="right"/>
+            </w:pPr>
+            <w:r>
+              <w:t xml:space="preserve">94.0</w:t>
+            </w:r>
+          </w:p>
+        </w:tc>
+        <w:tc>
+          <w:tcPr/>
+          <w:p>
+            <w:pPr>
+              <w:pStyle w:val="Compact"/>
+              <w:jc w:val="left"/>
+            </w:pPr>
+            <w:r>
+              <w:t xml:space="preserve">Опубликованный ряд</w:t>
             </w:r>
           </w:p>
         </w:tc>
@@ -21941,67 +21910,67 @@
               <w:jc w:val="right"/>
             </w:pPr>
             <w:r>
-              <w:t xml:space="preserve">нет данных</w:t>
-            </w:r>
-          </w:p>
-        </w:tc>
-        <w:tc>
-          <w:tcPr/>
-          <w:p>
-            <w:pPr>
-              <w:pStyle w:val="Compact"/>
-              <w:jc w:val="right"/>
-            </w:pPr>
-            <w:r>
-              <w:t xml:space="preserve">нет данных</w:t>
-            </w:r>
-          </w:p>
-        </w:tc>
-        <w:tc>
-          <w:tcPr/>
-          <w:p>
-            <w:pPr>
-              <w:pStyle w:val="Compact"/>
-              <w:jc w:val="right"/>
-            </w:pPr>
-            <w:r>
-              <w:t xml:space="preserve">нет данных</w:t>
-            </w:r>
-          </w:p>
-        </w:tc>
-        <w:tc>
-          <w:tcPr/>
-          <w:p>
-            <w:pPr>
-              <w:pStyle w:val="Compact"/>
-              <w:jc w:val="right"/>
-            </w:pPr>
-            <w:r>
-              <w:t xml:space="preserve">нет данных</w:t>
-            </w:r>
-          </w:p>
-        </w:tc>
-        <w:tc>
-          <w:tcPr/>
-          <w:p>
-            <w:pPr>
-              <w:pStyle w:val="Compact"/>
-              <w:jc w:val="right"/>
-            </w:pPr>
-            <w:r>
-              <w:t xml:space="preserve">нет данных</w:t>
-            </w:r>
-          </w:p>
-        </w:tc>
-        <w:tc>
-          <w:tcPr/>
-          <w:p>
-            <w:pPr>
-              <w:pStyle w:val="Compact"/>
-              <w:jc w:val="left"/>
-            </w:pPr>
-            <w:r>
-              <w:t xml:space="preserve">Опубликованный ряд: значение не получено</w:t>
+              <w:t xml:space="preserve">15.1</w:t>
+            </w:r>
+          </w:p>
+        </w:tc>
+        <w:tc>
+          <w:tcPr/>
+          <w:p>
+            <w:pPr>
+              <w:pStyle w:val="Compact"/>
+              <w:jc w:val="right"/>
+            </w:pPr>
+            <w:r>
+              <w:t xml:space="preserve">13.0</w:t>
+            </w:r>
+          </w:p>
+        </w:tc>
+        <w:tc>
+          <w:tcPr/>
+          <w:p>
+            <w:pPr>
+              <w:pStyle w:val="Compact"/>
+              <w:jc w:val="right"/>
+            </w:pPr>
+            <w:r>
+              <w:t xml:space="preserve">89.0</w:t>
+            </w:r>
+          </w:p>
+        </w:tc>
+        <w:tc>
+          <w:tcPr/>
+          <w:p>
+            <w:pPr>
+              <w:pStyle w:val="Compact"/>
+              <w:jc w:val="right"/>
+            </w:pPr>
+            <w:r>
+              <w:t xml:space="preserve">102.0</w:t>
+            </w:r>
+          </w:p>
+        </w:tc>
+        <w:tc>
+          <w:tcPr/>
+          <w:p>
+            <w:pPr>
+              <w:pStyle w:val="Compact"/>
+              <w:jc w:val="right"/>
+            </w:pPr>
+            <w:r>
+              <w:t xml:space="preserve">96.0</w:t>
+            </w:r>
+          </w:p>
+        </w:tc>
+        <w:tc>
+          <w:tcPr/>
+          <w:p>
+            <w:pPr>
+              <w:pStyle w:val="Compact"/>
+              <w:jc w:val="left"/>
+            </w:pPr>
+            <w:r>
+              <w:t xml:space="preserve">Опубликованный ряд</w:t>
             </w:r>
           </w:p>
         </w:tc>
@@ -22027,67 +21996,67 @@
               <w:jc w:val="right"/>
             </w:pPr>
             <w:r>
-              <w:t xml:space="preserve">нет данных</w:t>
-            </w:r>
-          </w:p>
-        </w:tc>
-        <w:tc>
-          <w:tcPr/>
-          <w:p>
-            <w:pPr>
-              <w:pStyle w:val="Compact"/>
-              <w:jc w:val="right"/>
-            </w:pPr>
-            <w:r>
-              <w:t xml:space="preserve">нет данных</w:t>
-            </w:r>
-          </w:p>
-        </w:tc>
-        <w:tc>
-          <w:tcPr/>
-          <w:p>
-            <w:pPr>
-              <w:pStyle w:val="Compact"/>
-              <w:jc w:val="right"/>
-            </w:pPr>
-            <w:r>
-              <w:t xml:space="preserve">нет данных</w:t>
-            </w:r>
-          </w:p>
-        </w:tc>
-        <w:tc>
-          <w:tcPr/>
-          <w:p>
-            <w:pPr>
-              <w:pStyle w:val="Compact"/>
-              <w:jc w:val="right"/>
-            </w:pPr>
-            <w:r>
-              <w:t xml:space="preserve">нет данных</w:t>
-            </w:r>
-          </w:p>
-        </w:tc>
-        <w:tc>
-          <w:tcPr/>
-          <w:p>
-            <w:pPr>
-              <w:pStyle w:val="Compact"/>
-              <w:jc w:val="right"/>
-            </w:pPr>
-            <w:r>
-              <w:t xml:space="preserve">нет данных</w:t>
-            </w:r>
-          </w:p>
-        </w:tc>
-        <w:tc>
-          <w:tcPr/>
-          <w:p>
-            <w:pPr>
-              <w:pStyle w:val="Compact"/>
-              <w:jc w:val="left"/>
-            </w:pPr>
-            <w:r>
-              <w:t xml:space="preserve">Опубликованный ряд: значение не получено</w:t>
+              <w:t xml:space="preserve">14.2</w:t>
+            </w:r>
+          </w:p>
+        </w:tc>
+        <w:tc>
+          <w:tcPr/>
+          <w:p>
+            <w:pPr>
+              <w:pStyle w:val="Compact"/>
+              <w:jc w:val="right"/>
+            </w:pPr>
+            <w:r>
+              <w:t xml:space="preserve">12.4</w:t>
+            </w:r>
+          </w:p>
+        </w:tc>
+        <w:tc>
+          <w:tcPr/>
+          <w:p>
+            <w:pPr>
+              <w:pStyle w:val="Compact"/>
+              <w:jc w:val="right"/>
+            </w:pPr>
+            <w:r>
+              <w:t xml:space="preserve">89.0</w:t>
+            </w:r>
+          </w:p>
+        </w:tc>
+        <w:tc>
+          <w:tcPr/>
+          <w:p>
+            <w:pPr>
+              <w:pStyle w:val="Compact"/>
+              <w:jc w:val="right"/>
+            </w:pPr>
+            <w:r>
+              <w:t xml:space="preserve">104.0</w:t>
+            </w:r>
+          </w:p>
+        </w:tc>
+        <w:tc>
+          <w:tcPr/>
+          <w:p>
+            <w:pPr>
+              <w:pStyle w:val="Compact"/>
+              <w:jc w:val="right"/>
+            </w:pPr>
+            <w:r>
+              <w:t xml:space="preserve">98.0</w:t>
+            </w:r>
+          </w:p>
+        </w:tc>
+        <w:tc>
+          <w:tcPr/>
+          <w:p>
+            <w:pPr>
+              <w:pStyle w:val="Compact"/>
+              <w:jc w:val="left"/>
+            </w:pPr>
+            <w:r>
+              <w:t xml:space="preserve">Опубликованный ряд</w:t>
             </w:r>
           </w:p>
         </w:tc>
@@ -22113,67 +22082,67 @@
               <w:jc w:val="right"/>
             </w:pPr>
             <w:r>
-              <w:t xml:space="preserve">нет данных</w:t>
-            </w:r>
-          </w:p>
-        </w:tc>
-        <w:tc>
-          <w:tcPr/>
-          <w:p>
-            <w:pPr>
-              <w:pStyle w:val="Compact"/>
-              <w:jc w:val="right"/>
-            </w:pPr>
-            <w:r>
-              <w:t xml:space="preserve">нет данных</w:t>
-            </w:r>
-          </w:p>
-        </w:tc>
-        <w:tc>
-          <w:tcPr/>
-          <w:p>
-            <w:pPr>
-              <w:pStyle w:val="Compact"/>
-              <w:jc w:val="right"/>
-            </w:pPr>
-            <w:r>
-              <w:t xml:space="preserve">нет данных</w:t>
-            </w:r>
-          </w:p>
-        </w:tc>
-        <w:tc>
-          <w:tcPr/>
-          <w:p>
-            <w:pPr>
-              <w:pStyle w:val="Compact"/>
-              <w:jc w:val="right"/>
-            </w:pPr>
-            <w:r>
-              <w:t xml:space="preserve">нет данных</w:t>
-            </w:r>
-          </w:p>
-        </w:tc>
-        <w:tc>
-          <w:tcPr/>
-          <w:p>
-            <w:pPr>
-              <w:pStyle w:val="Compact"/>
-              <w:jc w:val="right"/>
-            </w:pPr>
-            <w:r>
-              <w:t xml:space="preserve">нет данных</w:t>
-            </w:r>
-          </w:p>
-        </w:tc>
-        <w:tc>
-          <w:tcPr/>
-          <w:p>
-            <w:pPr>
-              <w:pStyle w:val="Compact"/>
-              <w:jc w:val="left"/>
-            </w:pPr>
-            <w:r>
-              <w:t xml:space="preserve">Опубликованный ряд: значение не получено</w:t>
+              <w:t xml:space="preserve">15.1</w:t>
+            </w:r>
+          </w:p>
+        </w:tc>
+        <w:tc>
+          <w:tcPr/>
+          <w:p>
+            <w:pPr>
+              <w:pStyle w:val="Compact"/>
+              <w:jc w:val="right"/>
+            </w:pPr>
+            <w:r>
+              <w:t xml:space="preserve">14.7</w:t>
+            </w:r>
+          </w:p>
+        </w:tc>
+        <w:tc>
+          <w:tcPr/>
+          <w:p>
+            <w:pPr>
+              <w:pStyle w:val="Compact"/>
+              <w:jc w:val="right"/>
+            </w:pPr>
+            <w:r>
+              <w:t xml:space="preserve">86.0</w:t>
+            </w:r>
+          </w:p>
+        </w:tc>
+        <w:tc>
+          <w:tcPr/>
+          <w:p>
+            <w:pPr>
+              <w:pStyle w:val="Compact"/>
+              <w:jc w:val="right"/>
+            </w:pPr>
+            <w:r>
+              <w:t xml:space="preserve">92.0</w:t>
+            </w:r>
+          </w:p>
+        </w:tc>
+        <w:tc>
+          <w:tcPr/>
+          <w:p>
+            <w:pPr>
+              <w:pStyle w:val="Compact"/>
+              <w:jc w:val="right"/>
+            </w:pPr>
+            <w:r>
+              <w:t xml:space="preserve">90.0</w:t>
+            </w:r>
+          </w:p>
+        </w:tc>
+        <w:tc>
+          <w:tcPr/>
+          <w:p>
+            <w:pPr>
+              <w:pStyle w:val="Compact"/>
+              <w:jc w:val="left"/>
+            </w:pPr>
+            <w:r>
+              <w:t xml:space="preserve">Опубликованный ряд</w:t>
             </w:r>
           </w:p>
         </w:tc>
@@ -22199,67 +22168,67 @@
               <w:jc w:val="right"/>
             </w:pPr>
             <w:r>
-              <w:t xml:space="preserve">нет данных</w:t>
-            </w:r>
-          </w:p>
-        </w:tc>
-        <w:tc>
-          <w:tcPr/>
-          <w:p>
-            <w:pPr>
-              <w:pStyle w:val="Compact"/>
-              <w:jc w:val="right"/>
-            </w:pPr>
-            <w:r>
-              <w:t xml:space="preserve">нет данных</w:t>
-            </w:r>
-          </w:p>
-        </w:tc>
-        <w:tc>
-          <w:tcPr/>
-          <w:p>
-            <w:pPr>
-              <w:pStyle w:val="Compact"/>
-              <w:jc w:val="right"/>
-            </w:pPr>
-            <w:r>
-              <w:t xml:space="preserve">нет данных</w:t>
-            </w:r>
-          </w:p>
-        </w:tc>
-        <w:tc>
-          <w:tcPr/>
-          <w:p>
-            <w:pPr>
-              <w:pStyle w:val="Compact"/>
-              <w:jc w:val="right"/>
-            </w:pPr>
-            <w:r>
-              <w:t xml:space="preserve">нет данных</w:t>
-            </w:r>
-          </w:p>
-        </w:tc>
-        <w:tc>
-          <w:tcPr/>
-          <w:p>
-            <w:pPr>
-              <w:pStyle w:val="Compact"/>
-              <w:jc w:val="right"/>
-            </w:pPr>
-            <w:r>
-              <w:t xml:space="preserve">нет данных</w:t>
-            </w:r>
-          </w:p>
-        </w:tc>
-        <w:tc>
-          <w:tcPr/>
-          <w:p>
-            <w:pPr>
-              <w:pStyle w:val="Compact"/>
-              <w:jc w:val="left"/>
-            </w:pPr>
-            <w:r>
-              <w:t xml:space="preserve">Опубликованный ряд: значение не получено</w:t>
+              <w:t xml:space="preserve">14.3</w:t>
+            </w:r>
+          </w:p>
+        </w:tc>
+        <w:tc>
+          <w:tcPr/>
+          <w:p>
+            <w:pPr>
+              <w:pStyle w:val="Compact"/>
+              <w:jc w:val="right"/>
+            </w:pPr>
+            <w:r>
+              <w:t xml:space="preserve">13.7</w:t>
+            </w:r>
+          </w:p>
+        </w:tc>
+        <w:tc>
+          <w:tcPr/>
+          <w:p>
+            <w:pPr>
+              <w:pStyle w:val="Compact"/>
+              <w:jc w:val="right"/>
+            </w:pPr>
+            <w:r>
+              <w:t xml:space="preserve">87.0</w:t>
+            </w:r>
+          </w:p>
+        </w:tc>
+        <w:tc>
+          <w:tcPr/>
+          <w:p>
+            <w:pPr>
+              <w:pStyle w:val="Compact"/>
+              <w:jc w:val="right"/>
+            </w:pPr>
+            <w:r>
+              <w:t xml:space="preserve">96.0</w:t>
+            </w:r>
+          </w:p>
+        </w:tc>
+        <w:tc>
+          <w:tcPr/>
+          <w:p>
+            <w:pPr>
+              <w:pStyle w:val="Compact"/>
+              <w:jc w:val="right"/>
+            </w:pPr>
+            <w:r>
+              <w:t xml:space="preserve">93.0</w:t>
+            </w:r>
+          </w:p>
+        </w:tc>
+        <w:tc>
+          <w:tcPr/>
+          <w:p>
+            <w:pPr>
+              <w:pStyle w:val="Compact"/>
+              <w:jc w:val="left"/>
+            </w:pPr>
+            <w:r>
+              <w:t xml:space="preserve">Опубликованный ряд</w:t>
             </w:r>
           </w:p>
         </w:tc>
@@ -22362,18 +22331,17 @@
     <w:tbl>
       <w:tblPr>
         <w:tblStyle w:val="Table"/>
-        <w:tblW w:type="pct" w:w="5000"/>
+        <w:tblW w:type="auto" w:w="0"/>
         <w:jc w:val="left"/>
-        <w:tblLayout w:type="fixed"/>
         <w:tblLook w:firstRow="1" w:lastRow="0" w:firstColumn="0" w:lastColumn="0" w:noHBand="0" w:noVBand="0" w:val="0020"/>
       </w:tblPr>
       <w:tblGrid>
-        <w:gridCol w:w="1721"/>
-        <w:gridCol w:w="946"/>
-        <w:gridCol w:w="774"/>
-        <w:gridCol w:w="946"/>
-        <w:gridCol w:w="688"/>
-        <w:gridCol w:w="2840"/>
+        <w:gridCol w:w="1320"/>
+        <w:gridCol w:w="1320"/>
+        <w:gridCol w:w="1320"/>
+        <w:gridCol w:w="1320"/>
+        <w:gridCol w:w="1320"/>
+        <w:gridCol w:w="1320"/>
       </w:tblGrid>
       <w:tr>
         <w:trPr>
@@ -22473,7 +22441,7 @@
               <w:jc w:val="right"/>
             </w:pPr>
             <w:r>
-              <w:t xml:space="preserve">нет данных</w:t>
+              <w:t xml:space="preserve">14.3</w:t>
             </w:r>
           </w:p>
         </w:tc>
@@ -22497,7 +22465,7 @@
               <w:jc w:val="right"/>
             </w:pPr>
             <w:r>
-              <w:t xml:space="preserve">нет данных</w:t>
+              <w:t xml:space="preserve">0.9</w:t>
             </w:r>
           </w:p>
         </w:tc>
@@ -22521,7 +22489,7 @@
               <w:jc w:val="left"/>
             </w:pPr>
             <w:r>
-              <w:t xml:space="preserve">Официальное значение не получено</w:t>
+              <w:t xml:space="preserve">Рассчитано</w:t>
             </w:r>
           </w:p>
         </w:tc>
@@ -22547,7 +22515,7 @@
               <w:jc w:val="right"/>
             </w:pPr>
             <w:r>
-              <w:t xml:space="preserve">нет данных</w:t>
+              <w:t xml:space="preserve">13.7</w:t>
             </w:r>
           </w:p>
         </w:tc>
@@ -22571,7 +22539,7 @@
               <w:jc w:val="right"/>
             </w:pPr>
             <w:r>
-              <w:t xml:space="preserve">нет данных</w:t>
+              <w:t xml:space="preserve">0.2</w:t>
             </w:r>
           </w:p>
         </w:tc>
@@ -22595,7 +22563,7 @@
               <w:jc w:val="left"/>
             </w:pPr>
             <w:r>
-              <w:t xml:space="preserve">Официальное значение не получено</w:t>
+              <w:t xml:space="preserve">Рассчитано</w:t>
             </w:r>
           </w:p>
         </w:tc>
@@ -22621,7 +22589,7 @@
               <w:jc w:val="right"/>
             </w:pPr>
             <w:r>
-              <w:t xml:space="preserve">нет данных</w:t>
+              <w:t xml:space="preserve">87.0</w:t>
             </w:r>
           </w:p>
         </w:tc>
@@ -22645,7 +22613,7 @@
               <w:jc w:val="right"/>
             </w:pPr>
             <w:r>
-              <w:t xml:space="preserve">нет данных</w:t>
+              <w:t xml:space="preserve">-0.7</w:t>
             </w:r>
           </w:p>
         </w:tc>
@@ -22669,7 +22637,7 @@
               <w:jc w:val="left"/>
             </w:pPr>
             <w:r>
-              <w:t xml:space="preserve">Официальное значение не получено</w:t>
+              <w:t xml:space="preserve">Рассчитано</w:t>
             </w:r>
           </w:p>
         </w:tc>
@@ -22695,7 +22663,7 @@
               <w:jc w:val="right"/>
             </w:pPr>
             <w:r>
-              <w:t xml:space="preserve">нет данных</w:t>
+              <w:t xml:space="preserve">96.0</w:t>
             </w:r>
           </w:p>
         </w:tc>
@@ -22719,7 +22687,7 @@
               <w:jc w:val="right"/>
             </w:pPr>
             <w:r>
-              <w:t xml:space="preserve">нет данных</w:t>
+              <w:t xml:space="preserve">1.3</w:t>
             </w:r>
           </w:p>
         </w:tc>
@@ -22743,7 +22711,7 @@
               <w:jc w:val="left"/>
             </w:pPr>
             <w:r>
-              <w:t xml:space="preserve">Официальное значение не получено</w:t>
+              <w:t xml:space="preserve">Рассчитано</w:t>
             </w:r>
           </w:p>
         </w:tc>
@@ -22769,7 +22737,7 @@
               <w:jc w:val="right"/>
             </w:pPr>
             <w:r>
-              <w:t xml:space="preserve">нет данных</w:t>
+              <w:t xml:space="preserve">93.0</w:t>
             </w:r>
           </w:p>
         </w:tc>
@@ -22793,7 +22761,7 @@
               <w:jc w:val="right"/>
             </w:pPr>
             <w:r>
-              <w:t xml:space="preserve">нет данных</w:t>
+              <w:t xml:space="preserve">-0.1</w:t>
             </w:r>
           </w:p>
         </w:tc>
@@ -22817,7 +22785,7 @@
               <w:jc w:val="left"/>
             </w:pPr>
             <w:r>
-              <w:t xml:space="preserve">Официальное значение не получено</w:t>
+              <w:t xml:space="preserve">Рассчитано</w:t>
             </w:r>
           </w:p>
         </w:tc>
@@ -22854,7 +22822,7 @@
         <w:t xml:space="preserve">пункт индекса</w:t>
       </w:r>
       <w:r>
-        <w:t xml:space="preserve">. Относительный темп изменения не подменяет разность. При NA за август разность также NA: направление изменения не определяется.</w:t>
+        <w:t xml:space="preserve">. Относительный темп изменения не подменяет разность. При интерпретации учитывается опубликованная точность исходных уровней.</w:t>
       </w:r>
     </w:p>
     <w:p>
@@ -22862,23 +22830,15 @@
         <w:pStyle w:val="BodyText"/>
       </w:pPr>
       <w:r>
-        <w:t xml:space="preserve">По учебному сентябрю наблюдаемая уточненная медиана (15,2%) выше ожидаемой (13,9%) на 1,3 п. п. ИТС = 86,3, ИПО = 97,3, ИПН = 92,9 пункта; все ниже 100. Уровень ожиданий выше оценки текущего состояния, однако утверждать согласованность или расхождение</w:t>
+        <w:t xml:space="preserve">По учебному сентябрю наблюдаемая уточненная медиана (15,2%) выше ожидаемой (13,9%) на 1,3 п. п. По сравнению с опубликованным августом наблюдаемая медиана изменилась на +0,9 п. п., ожидаемая — на +0,2 п. п. ИТС изменился на -0,7, ИПО — на +1,3, ИПН — на -0,1 пункта.</w:t>
       </w:r>
+    </w:p>
+    <w:p>
+      <w:pPr>
+        <w:pStyle w:val="BodyText"/>
+      </w:pPr>
       <w:r>
-        <w:t xml:space="preserve"> </w:t>
-      </w:r>
-      <w:r>
-        <w:rPr>
-          <w:b/>
-          <w:bCs/>
-        </w:rPr>
-        <w:t xml:space="preserve">временной динамики</w:t>
-      </w:r>
-      <w:r>
-        <w:t xml:space="preserve"> </w:t>
-      </w:r>
-      <w:r>
-        <w:t xml:space="preserve">без августовских уровней нельзя. После заполнения официальных данных таблица и графики пересчитываются автоматически; содержательную интерпретацию направлений также необходимо обновить.</w:t>
+        <w:t xml:space="preserve">Направления изменений ИТС и ИПО различаются: текущие оценки и ожидания изменились в разные стороны. В сентябрьском учебном расчете ИТС = 86,3, ИПО = 97,3, ИПН = 92,9 пункта; все ниже 100, то есть отрицательные оценки в среднем преобладают. ИПО выше ИТС: ожидания относительно благоприятнее текущих оценок. Разности вычислены без промежуточного округления учебных показателей, но точность официальных уровней ограничена подписями публикации. Малым разностям, особенно меньше одного пункта индекса, нельзя приписывать избыточную точность.</w:t>
       </w:r>
     </w:p>
     <w:p>
@@ -22978,23 +22938,7 @@
         </w:numPr>
       </w:pPr>
       <w:r>
-        <w:t xml:space="preserve">Воспроизводимые исходники и все расчетные таблицы подготовлены.</w:t>
-      </w:r>
-      <w:r>
-        <w:t xml:space="preserve"> </w:t>
-      </w:r>
-      <w:r>
-        <w:rPr>
-          <w:b/>
-          <w:bCs/>
-        </w:rPr>
-        <w:t xml:space="preserve">Обязательная историческая часть остается незавершенной:</w:t>
-      </w:r>
-      <w:r>
-        <w:t xml:space="preserve"> </w:t>
-      </w:r>
-      <w:r>
-        <w:t xml:space="preserve">требуется внести проверенные значения января–августа 2026 года в пять векторов, повторно собрать отчет и обновить интерпретацию динамики. Неподтвержденные числа не подставлялись.</w:t>
+        <w:t xml:space="preserve">Исторический ряд за январь–август 2026 года заполнен по предоставленной публикации; построены временные линии и отдельные учебные точки сентября, рассчитаны разности август → сентябрь. Официальные уровни за август: 14,3% и 13,7% для двух медиан, ИТС 87, ИПО 96, ИПН 93 пункта. Источник и точность зафиксированы; различия с синтетическими результатами являются только учебным сопоставлением.</w:t>
       </w:r>
     </w:p>
     <w:bookmarkEnd w:id="66"/>
@@ -23040,7 +22984,7 @@
         </w:numPr>
       </w:pPr>
       <w:r>
-        <w:t xml:space="preserve">ООО «инФОМ». Измерение инфляционных ожиданий и потребительских настроений на основе опросов населения. Отчет по восьмому опросу 2026 года, волна 162. Август 2026. Ссылка из методички:</w:t>
+        <w:t xml:space="preserve">ООО «инФОМ». Измерение инфляционных ожиданий и потребительских настроений на основе опросов населения. Август 2026, волна 162. Предоставленный PDF inFOM_26-08.pdf: с. 10, рис. 6; с. 14, рис. 12; с. 20, рис. 16; методические комментарии с. 74–78. Получен и проверен 18.10.2026. URL из методички:</w:t>
       </w:r>
       <w:r>
         <w:t xml:space="preserve"> </w:t>
@@ -23054,7 +22998,7 @@
         </w:r>
       </w:hyperlink>
       <w:r>
-        <w:t xml:space="preserve">. Попытка доступа: 18.10.2026, HTTP 403; содержимое не проверено и числовые значения не заимствованы.</w:t>
+        <w:t xml:space="preserve">. Точность: медианы 0,1 п. п., индексы 1 пункт.</w:t>
       </w:r>
     </w:p>
     <w:p>
@@ -23080,7 +23024,7 @@
         </w:r>
       </w:hyperlink>
       <w:r>
-        <w:t xml:space="preserve">. Попытка доступа: 18.10.2026, HTTP 403.</w:t>
+        <w:t xml:space="preserve">. Исторические значения проверены по предоставленному PDF отчета 18.10.2026.</w:t>
       </w:r>
     </w:p>
     <w:p>

</xml_diff>